<commit_message>
Preenche a identificacao da dupla no documento de entrega
Aluno 1: Lincoln Simao Pereira (RM 567284)
Aluno 2: Nicolas Sakaue (RM 567752)
Turma 2CCPS - 17/set/2026

Co-Authored-By: Claude Opus 5 (1M context) <noreply@anthropic.com>
</commit_message>
<xml_diff>
--- a/docs/Checkpoint1_NoDeBordaInteligente_PREENCHIDO.docx
+++ b/docs/Checkpoint1_NoDeBordaInteligente_PREENCHIDO.docx
@@ -63,64 +63,116 @@
         </w:tblBorders>
       </w:tblPr>
       <w:tblGrid>
-        <w:gridCol w:w="3209"/>
-        <w:gridCol w:w="5817"/>
+        <w:gridCol w:w="1300"/>
+        <w:gridCol w:w="3400"/>
+        <w:gridCol w:w="1100"/>
+        <w:gridCol w:w="3226"/>
       </w:tblGrid>
       <w:tr>
         <w:trPr>
-          <w:tblHeader/>
+          <w:cantSplit/>
         </w:trPr>
         <w:tc>
           <w:tcPr>
-            <w:tcW w:type="dxa" w:w="3209"/>
-            <w:shd w:fill="ED145B" w:val="clear"/>
-            <w:tcMar>
-              <w:top w:type="dxa" w:w="70"/>
-              <w:left w:type="dxa" w:w="110"/>
-              <w:bottom w:type="dxa" w:w="70"/>
-              <w:right w:type="dxa" w:w="110"/>
-            </w:tcMar>
-          </w:tcPr>
-          <w:p>
-            <w:pPr>
-              <w:spacing w:after="20" w:before="0" w:line="250"/>
+            <w:tcW w:type="dxa" w:w="1300"/>
+            <w:tcMar>
+              <w:top w:type="dxa" w:w="80"/>
+              <w:left w:type="dxa" w:w="120"/>
+              <w:bottom w:type="dxa" w:w="80"/>
+              <w:right w:type="dxa" w:w="120"/>
+            </w:tcMar>
+          </w:tcPr>
+          <w:p>
+            <w:pPr>
+              <w:spacing w:after="0" w:before="0" w:line="250"/>
             </w:pPr>
             <w:r>
               <w:rPr>
                 <w:b/>
                 <w:bCs/>
-                <w:color w:val="FFFFFF"/>
-                <w:sz w:val="17"/>
-                <w:szCs w:val="17"/>
-              </w:rPr>
-              <w:t xml:space="preserve">Identificação</w:t>
-            </w:r>
-          </w:p>
-        </w:tc>
-        <w:tc>
-          <w:tcPr>
-            <w:tcW w:type="dxa" w:w="5817"/>
-            <w:shd w:fill="ED145B" w:val="clear"/>
-            <w:tcMar>
-              <w:top w:type="dxa" w:w="70"/>
-              <w:left w:type="dxa" w:w="110"/>
-              <w:bottom w:type="dxa" w:w="70"/>
-              <w:right w:type="dxa" w:w="110"/>
-            </w:tcMar>
-          </w:tcPr>
-          <w:p>
-            <w:pPr>
-              <w:spacing w:after="20" w:before="0" w:line="250"/>
+                <w:color w:val="1A1A1A"/>
+                <w:sz w:val="19"/>
+                <w:szCs w:val="19"/>
+              </w:rPr>
+              <w:t xml:space="preserve">Aluno 1:</w:t>
+            </w:r>
+          </w:p>
+        </w:tc>
+        <w:tc>
+          <w:tcPr>
+            <w:tcW w:type="dxa" w:w="3400"/>
+            <w:tcMar>
+              <w:top w:type="dxa" w:w="80"/>
+              <w:left w:type="dxa" w:w="120"/>
+              <w:bottom w:type="dxa" w:w="80"/>
+              <w:right w:type="dxa" w:w="120"/>
+            </w:tcMar>
+          </w:tcPr>
+          <w:p>
+            <w:pPr>
+              <w:spacing w:after="0" w:before="0" w:line="250"/>
+            </w:pPr>
+            <w:r>
+              <w:rPr>
+                <w:b w:val="false"/>
+                <w:bCs w:val="false"/>
+                <w:color w:val="1A1A1A"/>
+                <w:sz w:val="19"/>
+                <w:szCs w:val="19"/>
+              </w:rPr>
+              <w:t xml:space="preserve">Lincoln Simao Pereira</w:t>
+            </w:r>
+          </w:p>
+        </w:tc>
+        <w:tc>
+          <w:tcPr>
+            <w:tcW w:type="dxa" w:w="1100"/>
+            <w:tcMar>
+              <w:top w:type="dxa" w:w="80"/>
+              <w:left w:type="dxa" w:w="120"/>
+              <w:bottom w:type="dxa" w:w="80"/>
+              <w:right w:type="dxa" w:w="120"/>
+            </w:tcMar>
+          </w:tcPr>
+          <w:p>
+            <w:pPr>
+              <w:spacing w:after="0" w:before="0" w:line="250"/>
             </w:pPr>
             <w:r>
               <w:rPr>
                 <w:b/>
                 <w:bCs/>
-                <w:color w:val="FFFFFF"/>
-                <w:sz w:val="17"/>
-                <w:szCs w:val="17"/>
-              </w:rPr>
-              <w:t xml:space="preserve">Preencher</w:t>
+                <w:color w:val="1A1A1A"/>
+                <w:sz w:val="19"/>
+                <w:szCs w:val="19"/>
+              </w:rPr>
+              <w:t xml:space="preserve">RM:</w:t>
+            </w:r>
+          </w:p>
+        </w:tc>
+        <w:tc>
+          <w:tcPr>
+            <w:tcW w:type="dxa" w:w="3226"/>
+            <w:tcMar>
+              <w:top w:type="dxa" w:w="80"/>
+              <w:left w:type="dxa" w:w="120"/>
+              <w:bottom w:type="dxa" w:w="80"/>
+              <w:right w:type="dxa" w:w="120"/>
+            </w:tcMar>
+          </w:tcPr>
+          <w:p>
+            <w:pPr>
+              <w:spacing w:after="0" w:before="0" w:line="250"/>
+            </w:pPr>
+            <w:r>
+              <w:rPr>
+                <w:b w:val="false"/>
+                <w:bCs w:val="false"/>
+                <w:color w:val="1A1A1A"/>
+                <w:sz w:val="19"/>
+                <w:szCs w:val="19"/>
+              </w:rPr>
+              <w:t xml:space="preserve">567284</w:t>
             </w:r>
           </w:p>
         </w:tc>
@@ -131,51 +183,105 @@
         </w:trPr>
         <w:tc>
           <w:tcPr>
-            <w:tcW w:type="dxa" w:w="3209"/>
-            <w:shd w:fill="FFFFFF" w:val="clear"/>
-            <w:tcMar>
-              <w:top w:type="dxa" w:w="70"/>
-              <w:left w:type="dxa" w:w="110"/>
-              <w:bottom w:type="dxa" w:w="70"/>
-              <w:right w:type="dxa" w:w="110"/>
-            </w:tcMar>
-          </w:tcPr>
-          <w:p>
-            <w:pPr>
-              <w:spacing w:after="20" w:before="0" w:line="250"/>
-            </w:pPr>
-            <w:r>
-              <w:rPr>
-                <w:color w:val="1A1A1A"/>
-                <w:sz w:val="17"/>
-                <w:szCs w:val="17"/>
-              </w:rPr>
-              <w:t xml:space="preserve">Aluno 1</w:t>
-            </w:r>
-          </w:p>
-        </w:tc>
-        <w:tc>
-          <w:tcPr>
-            <w:tcW w:type="dxa" w:w="5817"/>
-            <w:shd w:fill="FFFFFF" w:val="clear"/>
-            <w:tcMar>
-              <w:top w:type="dxa" w:w="70"/>
-              <w:left w:type="dxa" w:w="110"/>
-              <w:bottom w:type="dxa" w:w="70"/>
-              <w:right w:type="dxa" w:w="110"/>
-            </w:tcMar>
-          </w:tcPr>
-          <w:p>
-            <w:pPr>
-              <w:spacing w:after="20" w:before="0" w:line="250"/>
-            </w:pPr>
-            <w:r>
-              <w:rPr>
-                <w:color w:val="1A1A1A"/>
-                <w:sz w:val="17"/>
-                <w:szCs w:val="17"/>
+            <w:tcW w:type="dxa" w:w="1300"/>
+            <w:tcMar>
+              <w:top w:type="dxa" w:w="80"/>
+              <w:left w:type="dxa" w:w="120"/>
+              <w:bottom w:type="dxa" w:w="80"/>
+              <w:right w:type="dxa" w:w="120"/>
+            </w:tcMar>
+          </w:tcPr>
+          <w:p>
+            <w:pPr>
+              <w:spacing w:after="0" w:before="0" w:line="250"/>
+            </w:pPr>
+            <w:r>
+              <w:rPr>
+                <w:b/>
+                <w:bCs/>
+                <w:color w:val="1A1A1A"/>
+                <w:sz w:val="19"/>
+                <w:szCs w:val="19"/>
+              </w:rPr>
+              <w:t xml:space="preserve">Aluno 2:</w:t>
+            </w:r>
+          </w:p>
+        </w:tc>
+        <w:tc>
+          <w:tcPr>
+            <w:tcW w:type="dxa" w:w="3400"/>
+            <w:tcMar>
+              <w:top w:type="dxa" w:w="80"/>
+              <w:left w:type="dxa" w:w="120"/>
+              <w:bottom w:type="dxa" w:w="80"/>
+              <w:right w:type="dxa" w:w="120"/>
+            </w:tcMar>
+          </w:tcPr>
+          <w:p>
+            <w:pPr>
+              <w:spacing w:after="0" w:before="0" w:line="250"/>
+            </w:pPr>
+            <w:r>
+              <w:rPr>
+                <w:b w:val="false"/>
+                <w:bCs w:val="false"/>
+                <w:color w:val="1A1A1A"/>
+                <w:sz w:val="19"/>
+                <w:szCs w:val="19"/>
+              </w:rPr>
+              <w:t xml:space="preserve">Nicolas Sakaue</w:t>
+            </w:r>
+          </w:p>
+        </w:tc>
+        <w:tc>
+          <w:tcPr>
+            <w:tcW w:type="dxa" w:w="1100"/>
+            <w:tcMar>
+              <w:top w:type="dxa" w:w="80"/>
+              <w:left w:type="dxa" w:w="120"/>
+              <w:bottom w:type="dxa" w:w="80"/>
+              <w:right w:type="dxa" w:w="120"/>
+            </w:tcMar>
+          </w:tcPr>
+          <w:p>
+            <w:pPr>
+              <w:spacing w:after="0" w:before="0" w:line="250"/>
+            </w:pPr>
+            <w:r>
+              <w:rPr>
+                <w:b/>
+                <w:bCs/>
+                <w:color w:val="1A1A1A"/>
+                <w:sz w:val="19"/>
+                <w:szCs w:val="19"/>
               </w:rPr>
               <w:t xml:space="preserve">RM:</w:t>
+            </w:r>
+          </w:p>
+        </w:tc>
+        <w:tc>
+          <w:tcPr>
+            <w:tcW w:type="dxa" w:w="3226"/>
+            <w:tcMar>
+              <w:top w:type="dxa" w:w="80"/>
+              <w:left w:type="dxa" w:w="120"/>
+              <w:bottom w:type="dxa" w:w="80"/>
+              <w:right w:type="dxa" w:w="120"/>
+            </w:tcMar>
+          </w:tcPr>
+          <w:p>
+            <w:pPr>
+              <w:spacing w:after="0" w:before="0" w:line="250"/>
+            </w:pPr>
+            <w:r>
+              <w:rPr>
+                <w:b w:val="false"/>
+                <w:bCs w:val="false"/>
+                <w:color w:val="1A1A1A"/>
+                <w:sz w:val="19"/>
+                <w:szCs w:val="19"/>
+              </w:rPr>
+              <w:t xml:space="preserve">567752</w:t>
             </w:r>
           </w:p>
         </w:tc>
@@ -186,159 +292,180 @@
         </w:trPr>
         <w:tc>
           <w:tcPr>
-            <w:tcW w:type="dxa" w:w="3209"/>
-            <w:shd w:fill="FCFCFC" w:val="clear"/>
-            <w:tcMar>
-              <w:top w:type="dxa" w:w="70"/>
-              <w:left w:type="dxa" w:w="110"/>
-              <w:bottom w:type="dxa" w:w="70"/>
-              <w:right w:type="dxa" w:w="110"/>
-            </w:tcMar>
-          </w:tcPr>
-          <w:p>
-            <w:pPr>
-              <w:spacing w:after="20" w:before="0" w:line="250"/>
-            </w:pPr>
-            <w:r>
-              <w:rPr>
-                <w:color w:val="1A1A1A"/>
-                <w:sz w:val="17"/>
-                <w:szCs w:val="17"/>
-              </w:rPr>
-              <w:t xml:space="preserve">Aluno 2</w:t>
-            </w:r>
-          </w:p>
-        </w:tc>
-        <w:tc>
-          <w:tcPr>
-            <w:tcW w:type="dxa" w:w="5817"/>
-            <w:shd w:fill="FCFCFC" w:val="clear"/>
-            <w:tcMar>
-              <w:top w:type="dxa" w:w="70"/>
-              <w:left w:type="dxa" w:w="110"/>
-              <w:bottom w:type="dxa" w:w="70"/>
-              <w:right w:type="dxa" w:w="110"/>
-            </w:tcMar>
-          </w:tcPr>
-          <w:p>
-            <w:pPr>
-              <w:spacing w:after="20" w:before="0" w:line="250"/>
-            </w:pPr>
-            <w:r>
-              <w:rPr>
-                <w:color w:val="1A1A1A"/>
-                <w:sz w:val="17"/>
-                <w:szCs w:val="17"/>
-              </w:rPr>
-              <w:t xml:space="preserve">RM:</w:t>
+            <w:tcW w:type="dxa" w:w="1300"/>
+            <w:tcMar>
+              <w:top w:type="dxa" w:w="80"/>
+              <w:left w:type="dxa" w:w="120"/>
+              <w:bottom w:type="dxa" w:w="80"/>
+              <w:right w:type="dxa" w:w="120"/>
+            </w:tcMar>
+          </w:tcPr>
+          <w:p>
+            <w:pPr>
+              <w:spacing w:after="0" w:before="0" w:line="250"/>
+            </w:pPr>
+            <w:r>
+              <w:rPr>
+                <w:b/>
+                <w:bCs/>
+                <w:color w:val="1A1A1A"/>
+                <w:sz w:val="19"/>
+                <w:szCs w:val="19"/>
+              </w:rPr>
+              <w:t xml:space="preserve">Turma:</w:t>
+            </w:r>
+          </w:p>
+        </w:tc>
+        <w:tc>
+          <w:tcPr>
+            <w:tcW w:type="dxa" w:w="3400"/>
+            <w:tcMar>
+              <w:top w:type="dxa" w:w="80"/>
+              <w:left w:type="dxa" w:w="120"/>
+              <w:bottom w:type="dxa" w:w="80"/>
+              <w:right w:type="dxa" w:w="120"/>
+            </w:tcMar>
+          </w:tcPr>
+          <w:p>
+            <w:pPr>
+              <w:spacing w:after="0" w:before="0" w:line="250"/>
+            </w:pPr>
+            <w:r>
+              <w:rPr>
+                <w:b w:val="false"/>
+                <w:bCs w:val="false"/>
+                <w:color w:val="1A1A1A"/>
+                <w:sz w:val="19"/>
+                <w:szCs w:val="19"/>
+              </w:rPr>
+              <w:t xml:space="preserve">2CCPS</w:t>
+            </w:r>
+          </w:p>
+        </w:tc>
+        <w:tc>
+          <w:tcPr>
+            <w:tcW w:type="dxa" w:w="1100"/>
+            <w:tcMar>
+              <w:top w:type="dxa" w:w="80"/>
+              <w:left w:type="dxa" w:w="120"/>
+              <w:bottom w:type="dxa" w:w="80"/>
+              <w:right w:type="dxa" w:w="120"/>
+            </w:tcMar>
+          </w:tcPr>
+          <w:p>
+            <w:pPr>
+              <w:spacing w:after="0" w:before="0" w:line="250"/>
+            </w:pPr>
+            <w:r>
+              <w:rPr>
+                <w:b/>
+                <w:bCs/>
+                <w:color w:val="1A1A1A"/>
+                <w:sz w:val="19"/>
+                <w:szCs w:val="19"/>
+              </w:rPr>
+              <w:t xml:space="preserve">Data:</w:t>
+            </w:r>
+          </w:p>
+        </w:tc>
+        <w:tc>
+          <w:tcPr>
+            <w:tcW w:type="dxa" w:w="3226"/>
+            <w:tcMar>
+              <w:top w:type="dxa" w:w="80"/>
+              <w:left w:type="dxa" w:w="120"/>
+              <w:bottom w:type="dxa" w:w="80"/>
+              <w:right w:type="dxa" w:w="120"/>
+            </w:tcMar>
+          </w:tcPr>
+          <w:p>
+            <w:pPr>
+              <w:spacing w:after="0" w:before="0" w:line="250"/>
+            </w:pPr>
+            <w:r>
+              <w:rPr>
+                <w:b w:val="false"/>
+                <w:bCs w:val="false"/>
+                <w:color w:val="1A1A1A"/>
+                <w:sz w:val="19"/>
+                <w:szCs w:val="19"/>
+              </w:rPr>
+              <w:t xml:space="preserve">17/set/2026</w:t>
             </w:r>
           </w:p>
         </w:tc>
       </w:tr>
+    </w:tbl>
+    <w:p>
+      <w:pPr>
+        <w:spacing w:after="120"/>
+      </w:pPr>
+      <w:r>
+        <w:t xml:space="preserve"/>
+      </w:r>
+    </w:p>
+    <w:tbl>
+      <w:tblPr>
+        <w:tblW w:type="dxa" w:w="9026"/>
+        <w:tblBorders>
+          <w:top w:val="single" w:color="D9D9D9" w:sz="4"/>
+          <w:left w:val="single" w:color="D9D9D9" w:sz="4"/>
+          <w:bottom w:val="single" w:color="D9D9D9" w:sz="4"/>
+          <w:right w:val="single" w:color="D9D9D9" w:sz="4"/>
+          <w:insideH w:val="single" w:color="D9D9D9" w:sz="4"/>
+          <w:insideV w:val="single" w:color="D9D9D9" w:sz="4"/>
+        </w:tblBorders>
+      </w:tblPr>
+      <w:tblGrid>
+        <w:gridCol w:w="2600"/>
+        <w:gridCol w:w="6426"/>
+      </w:tblGrid>
       <w:tr>
         <w:trPr>
           <w:cantSplit/>
         </w:trPr>
         <w:tc>
           <w:tcPr>
-            <w:tcW w:type="dxa" w:w="3209"/>
-            <w:shd w:fill="FFFFFF" w:val="clear"/>
-            <w:tcMar>
-              <w:top w:type="dxa" w:w="70"/>
-              <w:left w:type="dxa" w:w="110"/>
-              <w:bottom w:type="dxa" w:w="70"/>
-              <w:right w:type="dxa" w:w="110"/>
-            </w:tcMar>
-          </w:tcPr>
-          <w:p>
-            <w:pPr>
-              <w:spacing w:after="20" w:before="0" w:line="250"/>
-            </w:pPr>
-            <w:r>
-              <w:rPr>
-                <w:color w:val="1A1A1A"/>
-                <w:sz w:val="17"/>
-                <w:szCs w:val="17"/>
-              </w:rPr>
-              <w:t xml:space="preserve">Turma</w:t>
-            </w:r>
-          </w:p>
-        </w:tc>
-        <w:tc>
-          <w:tcPr>
-            <w:tcW w:type="dxa" w:w="5817"/>
-            <w:shd w:fill="FFFFFF" w:val="clear"/>
-            <w:tcMar>
-              <w:top w:type="dxa" w:w="70"/>
-              <w:left w:type="dxa" w:w="110"/>
-              <w:bottom w:type="dxa" w:w="70"/>
-              <w:right w:type="dxa" w:w="110"/>
-            </w:tcMar>
-          </w:tcPr>
-          <w:p>
-            <w:pPr>
-              <w:spacing w:after="20" w:before="0" w:line="250"/>
-            </w:pPr>
-            <w:r>
-              <w:rPr>
-                <w:color w:val="1A1A1A"/>
-                <w:sz w:val="17"/>
-                <w:szCs w:val="17"/>
-              </w:rPr>
-              <w:t xml:space="preserve">Data:</w:t>
-            </w:r>
-          </w:p>
-        </w:tc>
-      </w:tr>
-      <w:tr>
-        <w:trPr>
-          <w:cantSplit/>
-        </w:trPr>
-        <w:tc>
-          <w:tcPr>
-            <w:tcW w:type="dxa" w:w="3209"/>
-            <w:shd w:fill="FCFCFC" w:val="clear"/>
-            <w:tcMar>
-              <w:top w:type="dxa" w:w="70"/>
-              <w:left w:type="dxa" w:w="110"/>
-              <w:bottom w:type="dxa" w:w="70"/>
-              <w:right w:type="dxa" w:w="110"/>
-            </w:tcMar>
-          </w:tcPr>
-          <w:p>
-            <w:pPr>
-              <w:spacing w:after="20" w:before="0" w:line="250"/>
-            </w:pPr>
-            <w:r>
-              <w:rPr>
-                <w:color w:val="1A1A1A"/>
-                <w:sz w:val="17"/>
-                <w:szCs w:val="17"/>
-              </w:rPr>
-              <w:t xml:space="preserve">Link do projeto (repositório)</w:t>
-            </w:r>
-          </w:p>
-        </w:tc>
-        <w:tc>
-          <w:tcPr>
-            <w:tcW w:type="dxa" w:w="5817"/>
-            <w:shd w:fill="FCFCFC" w:val="clear"/>
-            <w:tcMar>
-              <w:top w:type="dxa" w:w="70"/>
-              <w:left w:type="dxa" w:w="110"/>
-              <w:bottom w:type="dxa" w:w="70"/>
-              <w:right w:type="dxa" w:w="110"/>
-            </w:tcMar>
-          </w:tcPr>
-          <w:p>
-            <w:pPr>
-              <w:spacing w:after="20" w:before="0" w:line="250"/>
-            </w:pPr>
-            <w:r>
-              <w:rPr>
-                <w:color w:val="1A1A1A"/>
-                <w:sz w:val="17"/>
-                <w:szCs w:val="17"/>
+            <w:tcW w:type="dxa" w:w="2600"/>
+            <w:tcMar>
+              <w:top w:type="dxa" w:w="80"/>
+              <w:left w:type="dxa" w:w="120"/>
+              <w:bottom w:type="dxa" w:w="80"/>
+              <w:right w:type="dxa" w:w="120"/>
+            </w:tcMar>
+          </w:tcPr>
+          <w:p>
+            <w:r>
+              <w:rPr>
+                <w:b/>
+                <w:bCs/>
+                <w:color w:val="1A1A1A"/>
+                <w:sz w:val="19"/>
+                <w:szCs w:val="19"/>
+              </w:rPr>
+              <w:t xml:space="preserve">Link do projeto:</w:t>
+            </w:r>
+          </w:p>
+        </w:tc>
+        <w:tc>
+          <w:tcPr>
+            <w:tcW w:type="dxa" w:w="6426"/>
+            <w:tcMar>
+              <w:top w:type="dxa" w:w="80"/>
+              <w:left w:type="dxa" w:w="120"/>
+              <w:bottom w:type="dxa" w:w="80"/>
+              <w:right w:type="dxa" w:w="120"/>
+            </w:tcMar>
+          </w:tcPr>
+          <w:p>
+            <w:r>
+              <w:rPr>
+                <w:b/>
+                <w:bCs/>
+                <w:color w:val="1155CC"/>
+                <w:sz w:val="19"/>
+                <w:szCs w:val="19"/>
+                <w:u w:val="single"/>
               </w:rPr>
               <w:t xml:space="preserve">https://github.com/lincoln743/cp01_edgecomputing</w:t>
             </w:r>

</xml_diff>